<commit_message>
Update CLM OFT invitation: add cross-industry business-impact bullet, broaden audience to any industry
- Why attend: lead with measurable business impact (cycle time, rework/outside-counsel, revenue leakage) across any industry
- Who should attend: note applicability in any industry, not just legal/financial services

Co-authored-by: Copilot App <223556219+Copilot@users.noreply.github.com>
Copilot-Session: 2fc86db1-1f76-4b83-b234-329556a5f335
</commit_message>
<xml_diff>
--- a/docs/marketing/Agentic AI Hack_Contract Lifecycle Management_OFT.docx
+++ b/docs/marketing/Agentic AI Hack_Contract Lifecycle Management_OFT.docx
@@ -168,17 +168,17 @@
         <w:spacing w:after="100"/>
       </w:pPr>
       <w:r>
-        <w:t xml:space="preserve">Apply </w:t>
-      </w:r>
-      <w:r>
-        <w:rPr>
-          <w:b/>
-          <w:bCs/>
-        </w:rPr>
-        <w:t xml:space="preserve">agentic AI patterns</w:t>
-      </w:r>
-      <w:r>
-        <w:t xml:space="preserve"> to real contract lifecycle workflows — drafting, clause extraction, risk analysis, and renewal alerts</w:t>
+        <w:t xml:space="preserve">See the </w:t>
+      </w:r>
+      <w:r>
+        <w:rPr>
+          <w:b/>
+          <w:bCs/>
+        </w:rPr>
+        <w:t xml:space="preserve">measurable business impact</w:t>
+      </w:r>
+      <w:r>
+        <w:t xml:space="preserve"> of agentic CLM — faster request-to-signature, less rework and outside-counsel spend, and no revenue lost to missed renewals — with patterns that apply across any industry, not just legal or financial services</w:t>
       </w:r>
     </w:p>
     <w:p>
@@ -191,27 +191,17 @@
         <w:spacing w:after="100"/>
       </w:pPr>
       <w:r>
-        <w:t xml:space="preserve">Build </w:t>
-      </w:r>
-      <w:r>
-        <w:rPr>
-          <w:b/>
-          <w:bCs/>
-        </w:rPr>
-        <w:t xml:space="preserve">grounded, tool-using agents</w:t>
-      </w:r>
-      <w:r>
-        <w:t xml:space="preserve"> on a multi-model fleet (</w:t>
-      </w:r>
-      <w:r>
-        <w:rPr>
-          <w:b/>
-          <w:bCs/>
-        </w:rPr>
-        <w:t xml:space="preserve">Anthropic Claude + GPT</w:t>
-      </w:r>
-      <w:r>
-        <w:t xml:space="preserve">) inside a single Microsoft Foundry project</w:t>
+        <w:t xml:space="preserve">Apply </w:t>
+      </w:r>
+      <w:r>
+        <w:rPr>
+          <w:b/>
+          <w:bCs/>
+        </w:rPr>
+        <w:t xml:space="preserve">agentic AI patterns</w:t>
+      </w:r>
+      <w:r>
+        <w:t xml:space="preserve"> to real contract lifecycle workflows — drafting, clause extraction, risk analysis, and renewal alerts</w:t>
       </w:r>
     </w:p>
     <w:p>
@@ -224,17 +214,27 @@
         <w:spacing w:after="100"/>
       </w:pPr>
       <w:r>
-        <w:t xml:space="preserve">Ground answers on your own contract corpus with </w:t>
-      </w:r>
-      <w:r>
-        <w:rPr>
-          <w:b/>
-          <w:bCs/>
-        </w:rPr>
-        <w:t xml:space="preserve">Foundry IQ</w:t>
-      </w:r>
-      <w:r>
-        <w:t xml:space="preserve"> (agentic retrieval over Azure AI Search) and return cited, trustworthy responses</w:t>
+        <w:t xml:space="preserve">Build </w:t>
+      </w:r>
+      <w:r>
+        <w:rPr>
+          <w:b/>
+          <w:bCs/>
+        </w:rPr>
+        <w:t xml:space="preserve">grounded, tool-using agents</w:t>
+      </w:r>
+      <w:r>
+        <w:t xml:space="preserve"> on a multi-model fleet (</w:t>
+      </w:r>
+      <w:r>
+        <w:rPr>
+          <w:b/>
+          <w:bCs/>
+        </w:rPr>
+        <w:t xml:space="preserve">Anthropic Claude + GPT</w:t>
+      </w:r>
+      <w:r>
+        <w:t xml:space="preserve">) inside a single Microsoft Foundry project</w:t>
       </w:r>
     </w:p>
     <w:p>
@@ -247,24 +247,17 @@
         <w:spacing w:after="100"/>
       </w:pPr>
       <w:r>
-        <w:t xml:space="preserve">Design and orchestrate </w:t>
-      </w:r>
-      <w:r>
-        <w:rPr>
-          <w:b/>
-          <w:bCs/>
-        </w:rPr>
-        <w:t xml:space="preserve">multi-agent systems</w:t>
-      </w:r>
-      <w:r>
-        <w:t xml:space="preserve">, and expose your workflow as a reusable </w:t>
-      </w:r>
-      <w:r>
-        <w:rPr>
-          <w:b/>
-          <w:bCs/>
-        </w:rPr>
-        <w:t xml:space="preserve">Model Context Protocol (MCP) server</w:t>
+        <w:t xml:space="preserve">Ground answers on your own contract corpus with </w:t>
+      </w:r>
+      <w:r>
+        <w:rPr>
+          <w:b/>
+          <w:bCs/>
+        </w:rPr>
+        <w:t xml:space="preserve">Foundry IQ</w:t>
+      </w:r>
+      <w:r>
+        <w:t xml:space="preserve"> (agentic retrieval over Azure AI Search) and return cited, trustworthy responses</w:t>
       </w:r>
     </w:p>
     <w:p>
@@ -277,17 +270,24 @@
         <w:spacing w:after="100"/>
       </w:pPr>
       <w:r>
-        <w:t xml:space="preserve">Trace, evaluate, and quality-gate agents with </w:t>
-      </w:r>
-      <w:r>
-        <w:rPr>
-          <w:b/>
-          <w:bCs/>
-        </w:rPr>
-        <w:t xml:space="preserve">Microsoft Foundry observability</w:t>
-      </w:r>
-      <w:r>
-        <w:t xml:space="preserve"> (OpenTelemetry → Application Insights), including a Claude-vs-GPT evaluation bake-off</w:t>
+        <w:t xml:space="preserve">Design and orchestrate </w:t>
+      </w:r>
+      <w:r>
+        <w:rPr>
+          <w:b/>
+          <w:bCs/>
+        </w:rPr>
+        <w:t xml:space="preserve">multi-agent systems</w:t>
+      </w:r>
+      <w:r>
+        <w:t xml:space="preserve">, and expose your workflow as a reusable </w:t>
+      </w:r>
+      <w:r>
+        <w:rPr>
+          <w:b/>
+          <w:bCs/>
+        </w:rPr>
+        <w:t xml:space="preserve">Model Context Protocol (MCP) server</w:t>
       </w:r>
     </w:p>
     <w:p>
@@ -300,6 +300,29 @@
         <w:spacing w:after="100"/>
       </w:pPr>
       <w:r>
+        <w:t xml:space="preserve">Trace, evaluate, and quality-gate agents with </w:t>
+      </w:r>
+      <w:r>
+        <w:rPr>
+          <w:b/>
+          <w:bCs/>
+        </w:rPr>
+        <w:t xml:space="preserve">Microsoft Foundry observability</w:t>
+      </w:r>
+      <w:r>
+        <w:t xml:space="preserve"> (OpenTelemetry → Application Insights), including a Claude-vs-GPT evaluation bake-off</w:t>
+      </w:r>
+    </w:p>
+    <w:p>
+      <w:pPr>
+        <w:pStyle w:val="ListParagraph"/>
+        <w:numPr>
+          <w:ilvl w:val="0"/>
+          <w:numId w:val="2"/>
+        </w:numPr>
+        <w:spacing w:after="100"/>
+      </w:pPr>
+      <w:r>
         <w:t xml:space="preserve">Publish your assistant to </w:t>
       </w:r>
       <w:r>
@@ -343,7 +366,7 @@
         <w:t xml:space="preserve">contract lifecycle management, document automation, and agentic AI</w:t>
       </w:r>
       <w:r>
-        <w:t xml:space="preserve"> — alongside the legal, procurement, and operations teams who own these workflows.</w:t>
+        <w:t xml:space="preserve"> in any industry — alongside the legal, procurement, and operations teams who own these workflows.</w:t>
       </w:r>
     </w:p>
     <w:p>

</xml_diff>